<commit_message>
Docs: guides updated for Excel import + fix stale gradebook section
The import guides now say "Nhập Excel" / "Nhập điểm (Excel)" and note that the
templates download as .xlsx. Deliberately left the genuinely-CSV parts alone:
the risk report export and the SIS/LMS Google-Sheet sync both still use CSV.

Also rewrote section 1 of the new-features guide, which still described a
"Bảng điểm" page with "Xuất Excel" and "Khóa điểm"/"Mở khóa" buttons that no
longer exist in the app. It now documents the "Nhập điểm" page and records that
grade locking is still enforced but has no UI toggle.

Co-Authored-By: Claude Opus 4.8 <noreply@anthropic.com>
</commit_message>
<xml_diff>
--- a/Project for Capstone 2/student_risk_system/Huong-dan-su-dung-va-quan-tri.docx
+++ b/Project for Capstone 2/student_risk_system/Huong-dan-su-dung-va-quan-tri.docx
@@ -774,7 +774,7 @@
           <w:sz w:val="22"/>
           <w:szCs w:val="22"/>
         </w:rPr>
-        <w:t xml:space="preserve">trên web bấm “Tải mẫu” để có đúng cột rồi tự điền.</w:t>
+        <w:t xml:space="preserve">trên web bấm “Tải mẫu” (file .xlsx) để có đúng cột rồi tự điền.</w:t>
       </w:r>
     </w:p>
     <w:p>
@@ -856,7 +856,7 @@
           <w:sz w:val="22"/>
           <w:szCs w:val="22"/>
         </w:rPr>
-        <w:t xml:space="preserve">“Nhập CSV”</w:t>
+        <w:t xml:space="preserve">“Nhập Excel”</w:t>
       </w:r>
       <w:r>
         <w:rPr>
@@ -911,7 +911,7 @@
           <w:sz w:val="22"/>
           <w:szCs w:val="22"/>
         </w:rPr>
-        <w:t xml:space="preserve">Hãy GIỮ LẠI file CSV bạn nhập (có cột student_code, email, password) — </w:t>
+        <w:t xml:space="preserve">Hãy GIỮ LẠI file Excel bạn nhập (có cột student_code, email, password) — </w:t>
       </w:r>
       <w:r>
         <w:rPr>
@@ -1231,7 +1231,7 @@
           <w:sz w:val="22"/>
           <w:szCs w:val="22"/>
         </w:rPr>
-        <w:t xml:space="preserve">Gửi mỗi em: email + mật khẩu khởi tạo (lấy từ file CSV đã lưu ở bước B). Dặn các em đổi mật khẩu sau lần đăng nhập đầu.</w:t>
+        <w:t xml:space="preserve">Gửi mỗi em: email + mật khẩu khởi tạo (lấy từ file Excel đã lưu ở bước B). Dặn các em đổi mật khẩu sau lần đăng nhập đầu.</w:t>
       </w:r>
     </w:p>
     <w:p>
@@ -1319,7 +1319,7 @@
           <w:sz w:val="22"/>
           <w:szCs w:val="22"/>
         </w:rPr>
-        <w:t xml:space="preserve">Web → Cố vấn → Sinh viên → “Tải mẫu điểm” → điền → “Nhập điểm”. Mỗi dòng là MỘT môn của MỘT sinh viên; hệ thống khớp theo MSSV rồi tự tính điểm chữ, GPA &amp; rủi ro.</w:t>
+        <w:t xml:space="preserve">Web → Cố vấn → Sinh viên → “Tải mẫu điểm” → điền → “Nhập điểm (Excel)”. Mỗi dòng là MỘT môn của MỘT sinh viên; hệ thống khớp theo MSSV rồi tự tính điểm chữ, GPA &amp; rủi ro.</w:t>
       </w:r>
     </w:p>
     <w:p>
@@ -1878,7 +1878,7 @@
           <w:sz w:val="22"/>
           <w:szCs w:val="22"/>
         </w:rPr>
-        <w:t xml:space="preserve">tìm kiếm, lọc theo mức, cột “Dự đoán” vào vùng báo động; Thêm sinh viên / Nhập CSV / Nhập điểm.</w:t>
+        <w:t xml:space="preserve">tìm kiếm, lọc theo mức, cột “Dự đoán” vào vùng báo động; Thêm sinh viên / Nhập Excel / Nhập điểm (Excel).</w:t>
       </w:r>
     </w:p>
     <w:p>

</xml_diff>